<commit_message>
Provenance: TKB source + exclusion rule recorded; notices row for the teaching index
Co-Authored-By: Claude Fable 5 <noreply@anthropic.com>
</commit_message>
<xml_diff>
--- a/docs/distribution/OPEN_SOURCE_NOTICES.docx
+++ b/docs/distribution/OPEN_SOURCE_NOTICES.docx
@@ -991,6 +991,26 @@
         </w:tc>
       </w:tr>
     </w:tbl>
+    <w:p>
+      <w:pPr>
+        <w:pStyle w:val="BodyText"/>
+      </w:pPr>
+      <w:r>
+        <w:t xml:space="preserve">Teaching-moments index (Diamond Cutter Classics + The Knowledge Base YouTube channels) | Geshe Michael Roach’s own organizations’ teachings, harvested captions-only with ALL’s authorization (data/teaching/PROVENANCE.md); links open the original recordings | timecoded</w:t>
+      </w:r>
+      <w:r>
+        <w:t xml:space="preserve"> </w:t>
+      </w:r>
+      <w:r>
+        <w:t xml:space="preserve">“teaching this term”</w:t>
+      </w:r>
+      <w:r>
+        <w:t xml:space="preserve"> </w:t>
+      </w:r>
+      <w:r>
+        <w:t xml:space="preserve">links on entry cards; machine-located, labeled |</w:t>
+      </w:r>
+    </w:p>
     <w:bookmarkEnd w:id="11"/>
     <w:bookmarkStart w:id="12" w:name="the-dictionary-and-corpus"/>
     <w:p>

</xml_diff>

<commit_message>
Notices: teaching-index row joined into the data-layers table
Co-Authored-By: Claude Fable 5 <noreply@anthropic.com>
</commit_message>
<xml_diff>
--- a/docs/distribution/OPEN_SOURCE_NOTICES.docx
+++ b/docs/distribution/OPEN_SOURCE_NOTICES.docx
@@ -990,27 +990,54 @@
           </w:p>
         </w:tc>
       </w:tr>
+      <w:tr>
+        <w:tc>
+          <w:tcPr/>
+          <w:p>
+            <w:pPr>
+              <w:pStyle w:val="Compact"/>
+            </w:pPr>
+            <w:r>
+              <w:t xml:space="preserve">Teaching-moments index (Diamond Cutter Classics + The Knowledge Base YouTube channels)</w:t>
+            </w:r>
+          </w:p>
+        </w:tc>
+        <w:tc>
+          <w:tcPr/>
+          <w:p>
+            <w:pPr>
+              <w:pStyle w:val="Compact"/>
+            </w:pPr>
+            <w:r>
+              <w:t xml:space="preserve">Geshe Michael Roach’s own organizations’ teachings, harvested captions-only with ALL’s authorization (data/teaching/PROVENANCE.md); links open the original recordings</w:t>
+            </w:r>
+          </w:p>
+        </w:tc>
+        <w:tc>
+          <w:tcPr/>
+          <w:p>
+            <w:pPr>
+              <w:pStyle w:val="Compact"/>
+            </w:pPr>
+            <w:r>
+              <w:t xml:space="preserve">timecoded</w:t>
+            </w:r>
+            <w:r>
+              <w:t xml:space="preserve"> </w:t>
+            </w:r>
+            <w:r>
+              <w:t xml:space="preserve">“teaching this term”</w:t>
+            </w:r>
+            <w:r>
+              <w:t xml:space="preserve"> </w:t>
+            </w:r>
+            <w:r>
+              <w:t xml:space="preserve">links on entry cards; machine-located, labeled</w:t>
+            </w:r>
+          </w:p>
+        </w:tc>
+      </w:tr>
     </w:tbl>
-    <w:p>
-      <w:pPr>
-        <w:pStyle w:val="BodyText"/>
-      </w:pPr>
-      <w:r>
-        <w:t xml:space="preserve">Teaching-moments index (Diamond Cutter Classics + The Knowledge Base YouTube channels) | Geshe Michael Roach’s own organizations’ teachings, harvested captions-only with ALL’s authorization (data/teaching/PROVENANCE.md); links open the original recordings | timecoded</w:t>
-      </w:r>
-      <w:r>
-        <w:t xml:space="preserve"> </w:t>
-      </w:r>
-      <w:r>
-        <w:t xml:space="preserve">“teaching this term”</w:t>
-      </w:r>
-      <w:r>
-        <w:t xml:space="preserve"> </w:t>
-      </w:r>
-      <w:r>
-        <w:t xml:space="preserve">links on entry cards; machine-located, labeled |</w:t>
-      </w:r>
-    </w:p>
     <w:bookmarkEnd w:id="11"/>
     <w:bookmarkStart w:id="12" w:name="the-dictionary-and-corpus"/>
     <w:p>

</xml_diff>